<commit_message>
removing temp files, extending specification document, and updating .gitignore to ignore temp files
</commit_message>
<xml_diff>
--- a/Requirements MVP.docx
+++ b/Requirements MVP.docx
@@ -90,26 +90,10 @@
         <w:t xml:space="preserve">, </w:t>
       </w:r>
       <w:r>
-        <w:t>.</w:t>
-      </w:r>
-      <w:proofErr w:type="spellStart"/>
-      <w:r>
-        <w:t>png</w:t>
-      </w:r>
-      <w:proofErr w:type="spellEnd"/>
-      <w:r>
-        <w:t xml:space="preserve"> </w:t>
-      </w:r>
-      <w:r>
-        <w:t>and .</w:t>
-      </w:r>
-      <w:proofErr w:type="spellStart"/>
-      <w:r>
-        <w:t>webp</w:t>
-      </w:r>
-      <w:proofErr w:type="spellEnd"/>
-      <w:r>
-        <w:t xml:space="preserve"> </w:t>
+        <w:t xml:space="preserve">.png </w:t>
+      </w:r>
+      <w:r>
+        <w:t xml:space="preserve">and .webp </w:t>
       </w:r>
       <w:r>
         <w:t>files into consideration, and the order is determined by the default name ordering of windows. If this is the first time the program runs, or the previous image was the last on the list, then the program takes the first image in the list.</w:t>
@@ -117,15 +101,7 @@
     </w:p>
     <w:p>
       <w:r>
-        <w:t>After determining the next image to be used, the program creates a background file of .</w:t>
-      </w:r>
-      <w:proofErr w:type="spellStart"/>
-      <w:r>
-        <w:t>png</w:t>
-      </w:r>
-      <w:proofErr w:type="spellEnd"/>
-      <w:r>
-        <w:t xml:space="preserve"> format. The dimensions are determined by the current display resolution of the first display.</w:t>
+        <w:t>After determining the next image to be used, the program creates a background file of .png format. The dimensions are determined by the current display resolution of the first display.</w:t>
       </w:r>
     </w:p>
     <w:p>
@@ -144,7 +120,28 @@
         <w:t>The program then sets the Windows background of the first display to the created background image, then writes the name of the image to settings.ini as the previous image used, and exits.</w:t>
       </w:r>
     </w:p>
-    <w:p/>
+    <w:p>
+      <w:pPr>
+        <w:pStyle w:val="Heading1"/>
+      </w:pPr>
+      <w:r>
+        <w:t>V 0.1: adding multi-monitor support</w:t>
+      </w:r>
+    </w:p>
+    <w:p>
+      <w:pPr>
+        <w:rPr>
+          <w:lang w:val="hu-HU"/>
+        </w:rPr>
+      </w:pPr>
+      <w:r>
+        <w:t xml:space="preserve">Currently the program changes the background of all connected displays to the same background image. Please change the program so it creates a separate background file for all connected </w:t>
+      </w:r>
+      <w:r>
+        <w:lastRenderedPageBreak/>
+        <w:t>monitors, using the same algorithm as above – so for example on monitor 1 the next image will be taken, fit, and displayed, while on monitor 2 the image after the next. Same rules apply for the next image as before.</w:t>
+      </w:r>
+    </w:p>
     <w:sectPr>
       <w:pgSz w:w="11906" w:h="16838"/>
       <w:pgMar w:top="1440" w:right="1440" w:bottom="1440" w:left="1440" w:header="708" w:footer="708" w:gutter="0"/>
@@ -761,7 +758,6 @@
   <w:style w:type="character" w:default="1" w:styleId="DefaultParagraphFont">
     <w:name w:val="Default Paragraph Font"/>
     <w:uiPriority w:val="1"/>
-    <w:semiHidden/>
     <w:unhideWhenUsed/>
   </w:style>
   <w:style w:type="table" w:default="1" w:styleId="TableNormal">

</xml_diff>

<commit_message>
adding the next requirement for the next change.
</commit_message>
<xml_diff>
--- a/Requirements MVP.docx
+++ b/Requirements MVP.docx
@@ -90,10 +90,26 @@
         <w:t xml:space="preserve">, </w:t>
       </w:r>
       <w:r>
-        <w:t xml:space="preserve">.png </w:t>
-      </w:r>
-      <w:r>
-        <w:t xml:space="preserve">and .webp </w:t>
+        <w:t>.</w:t>
+      </w:r>
+      <w:proofErr w:type="spellStart"/>
+      <w:r>
+        <w:t>png</w:t>
+      </w:r>
+      <w:proofErr w:type="spellEnd"/>
+      <w:r>
+        <w:t xml:space="preserve"> </w:t>
+      </w:r>
+      <w:r>
+        <w:t>and .</w:t>
+      </w:r>
+      <w:proofErr w:type="spellStart"/>
+      <w:r>
+        <w:t>webp</w:t>
+      </w:r>
+      <w:proofErr w:type="spellEnd"/>
+      <w:r>
+        <w:t xml:space="preserve"> </w:t>
       </w:r>
       <w:r>
         <w:t>files into consideration, and the order is determined by the default name ordering of windows. If this is the first time the program runs, or the previous image was the last on the list, then the program takes the first image in the list.</w:t>
@@ -101,7 +117,15 @@
     </w:p>
     <w:p>
       <w:r>
-        <w:t>After determining the next image to be used, the program creates a background file of .png format. The dimensions are determined by the current display resolution of the first display.</w:t>
+        <w:t>After determining the next image to be used, the program creates a background file of .</w:t>
+      </w:r>
+      <w:proofErr w:type="spellStart"/>
+      <w:r>
+        <w:t>png</w:t>
+      </w:r>
+      <w:proofErr w:type="spellEnd"/>
+      <w:r>
+        <w:t xml:space="preserve"> format. The dimensions are determined by the current display resolution of the first display.</w:t>
       </w:r>
     </w:p>
     <w:p>
@@ -129,11 +153,6 @@
       </w:r>
     </w:p>
     <w:p>
-      <w:pPr>
-        <w:rPr>
-          <w:lang w:val="hu-HU"/>
-        </w:rPr>
-      </w:pPr>
       <w:r>
         <w:t xml:space="preserve">Currently the program changes the background of all connected displays to the same background image. Please change the program so it creates a separate background file for all connected </w:t>
       </w:r>
@@ -142,6 +161,35 @@
         <w:t>monitors, using the same algorithm as above – so for example on monitor 1 the next image will be taken, fit, and displayed, while on monitor 2 the image after the next. Same rules apply for the next image as before.</w:t>
       </w:r>
     </w:p>
+    <w:p>
+      <w:pPr>
+        <w:pStyle w:val="Heading1"/>
+      </w:pPr>
+      <w:r>
+        <w:t>V 0.</w:t>
+      </w:r>
+      <w:r>
+        <w:t>2</w:t>
+      </w:r>
+      <w:r>
+        <w:t xml:space="preserve">: </w:t>
+      </w:r>
+      <w:r>
+        <w:t>changing the background to fit the image</w:t>
+      </w:r>
+    </w:p>
+    <w:p>
+      <w:r>
+        <w:t xml:space="preserve">Previously the </w:t>
+      </w:r>
+      <w:r>
+        <w:t>part of the background not covered by the image was filled black. We want to fill this space filled with a more appropriate color matching the image. This is typically the most prominent color in the image</w:t>
+      </w:r>
+      <w:r>
+        <w:t>, but taking the border areas with more weight into consideration than the middle of the image typically yields better results.</w:t>
+      </w:r>
+    </w:p>
+    <w:p/>
     <w:sectPr>
       <w:pgSz w:w="11906" w:h="16838"/>
       <w:pgMar w:top="1440" w:right="1440" w:bottom="1440" w:left="1440" w:header="708" w:footer="708" w:gutter="0"/>
@@ -758,6 +806,7 @@
   <w:style w:type="character" w:default="1" w:styleId="DefaultParagraphFont">
     <w:name w:val="Default Paragraph Font"/>
     <w:uiPriority w:val="1"/>
+    <w:semiHidden/>
     <w:unhideWhenUsed/>
   </w:style>
   <w:style w:type="table" w:default="1" w:styleId="TableNormal">

</xml_diff>

<commit_message>
added requirements for running as a resident process
</commit_message>
<xml_diff>
--- a/Requirements MVP.docx
+++ b/Requirements MVP.docx
@@ -166,29 +166,96 @@
         <w:pStyle w:val="Heading1"/>
       </w:pPr>
       <w:r>
+        <w:t xml:space="preserve">V 0.2: </w:t>
+      </w:r>
+      <w:r>
+        <w:t>changing the background to fit the image</w:t>
+      </w:r>
+    </w:p>
+    <w:p>
+      <w:r>
+        <w:t xml:space="preserve">Previously the </w:t>
+      </w:r>
+      <w:r>
+        <w:t>part of the background not covered by the image was filled black. We want to fill this space filled with a more appropriate color matching the image. This is typically the most prominent color in the image</w:t>
+      </w:r>
+      <w:r>
+        <w:t>, but taking the border areas with more weight into consideration than the middle of the image typically yields better results.</w:t>
+      </w:r>
+    </w:p>
+    <w:p>
+      <w:pPr>
+        <w:pStyle w:val="Heading1"/>
+      </w:pPr>
+      <w:r>
         <w:t>V 0.</w:t>
       </w:r>
       <w:r>
-        <w:t>2</w:t>
+        <w:t>3</w:t>
       </w:r>
       <w:r>
         <w:t xml:space="preserve">: </w:t>
       </w:r>
       <w:r>
-        <w:t>changing the background to fit the image</w:t>
-      </w:r>
-    </w:p>
-    <w:p>
-      <w:r>
-        <w:t xml:space="preserve">Previously the </w:t>
-      </w:r>
-      <w:r>
-        <w:t>part of the background not covered by the image was filled black. We want to fill this space filled with a more appropriate color matching the image. This is typically the most prominent color in the image</w:t>
-      </w:r>
-      <w:r>
-        <w:t>, but taking the border areas with more weight into consideration than the middle of the image typically yields better results.</w:t>
-      </w:r>
-    </w:p>
+        <w:t>running as a resident program</w:t>
+      </w:r>
+    </w:p>
+    <w:p>
+      <w:r>
+        <w:t>Currently the program changes the wallpapers, and exits. I need it to remain running as a background process, displaying a tray icon. The original process spawns the resident process and exits. The resident process displays the tray icon and keeps running until it gets a command to exit.</w:t>
+      </w:r>
+    </w:p>
+    <w:p>
+      <w:r>
+        <w:t xml:space="preserve">For the tray icon use a down-sized version of </w:t>
+      </w:r>
+      <w:hyperlink r:id="rId5" w:history="1">
+        <w:r>
+          <w:rPr>
+            <w:rStyle w:val="Hyperlink"/>
+          </w:rPr>
+          <w:t>https://t3.ftcdn.net/jpg/01/62/84/92/360_F_162849266_m8X0HwafH2CVtoy7s7Tk1nXh1eQSPIf2.jpg</w:t>
+        </w:r>
+      </w:hyperlink>
+      <w:r>
+        <w:t xml:space="preserve"> . Include this tray icon image with the project files.</w:t>
+      </w:r>
+    </w:p>
+    <w:p>
+      <w:r>
+        <w:t>Hovering over the tray icon displays the name of the program – “Simple Wallpaper Changer”.</w:t>
+      </w:r>
+    </w:p>
+    <w:p>
+      <w:r>
+        <w:t>Right-clicking the tray icon allows the selection of the following operations:</w:t>
+      </w:r>
+    </w:p>
+    <w:p>
+      <w:pPr>
+        <w:pStyle w:val="ListParagraph"/>
+        <w:numPr>
+          <w:ilvl w:val="0"/>
+          <w:numId w:val="1"/>
+        </w:numPr>
+      </w:pPr>
+      <w:r>
+        <w:t>Next: selecting this menu item starts the changing of wallpapers, as per the previous functionality</w:t>
+      </w:r>
+    </w:p>
+    <w:p>
+      <w:pPr>
+        <w:pStyle w:val="ListParagraph"/>
+        <w:numPr>
+          <w:ilvl w:val="0"/>
+          <w:numId w:val="1"/>
+        </w:numPr>
+      </w:pPr>
+      <w:r>
+        <w:t>Exit: ends the resident process, cleaning up all temporary resources like temporary files</w:t>
+      </w:r>
+    </w:p>
+    <w:p/>
     <w:p/>
     <w:sectPr>
       <w:pgSz w:w="11906" w:h="16838"/>
@@ -198,6 +265,126 @@
     </w:sectPr>
   </w:body>
 </w:document>
+</file>
+
+<file path=word/numbering.xml><?xml version="1.0" encoding="utf-8"?>
+<w:numbering xmlns:wpc="http://schemas.microsoft.com/office/word/2010/wordprocessingCanvas" xmlns:cx="http://schemas.microsoft.com/office/drawing/2014/chartex" xmlns:cx1="http://schemas.microsoft.com/office/drawing/2015/9/8/chartex" xmlns:cx2="http://schemas.microsoft.com/office/drawing/2015/10/21/chartex" xmlns:cx3="http://schemas.microsoft.com/office/drawing/2016/5/9/chartex" xmlns:cx4="http://schemas.microsoft.com/office/drawing/2016/5/10/chartex" xmlns:cx5="http://schemas.microsoft.com/office/drawing/2016/5/11/chartex" xmlns:cx6="http://schemas.microsoft.com/office/drawing/2016/5/12/chartex" xmlns:cx7="http://schemas.microsoft.com/office/drawing/2016/5/13/chartex" xmlns:cx8="http://schemas.microsoft.com/office/drawing/2016/5/14/chartex" xmlns:mc="http://schemas.openxmlformats.org/markup-compatibility/2006" xmlns:aink="http://schemas.microsoft.com/office/drawing/2016/ink" xmlns:am3d="http://schemas.microsoft.com/office/drawing/2017/model3d" xmlns:o="urn:schemas-microsoft-com:office:office" xmlns:oel="http://schemas.microsoft.com/office/2019/extlst" xmlns:r="http://schemas.openxmlformats.org/officeDocument/2006/relationships" xmlns:m="http://schemas.openxmlformats.org/officeDocument/2006/math" xmlns:v="urn:schemas-microsoft-com:vml" xmlns:wp14="http://schemas.microsoft.com/office/word/2010/wordprocessingDrawing" xmlns:wp="http://schemas.openxmlformats.org/drawingml/2006/wordprocessingDrawing" xmlns:w10="urn:schemas-microsoft-com:office:word" xmlns:w="http://schemas.openxmlformats.org/wordprocessingml/2006/main" xmlns:w14="http://schemas.microsoft.com/office/word/2010/wordml" xmlns:w15="http://schemas.microsoft.com/office/word/2012/wordml" xmlns:w16cex="http://schemas.microsoft.com/office/word/2018/wordml/cex" xmlns:w16cid="http://schemas.microsoft.com/office/word/2016/wordml/cid" xmlns:w16="http://schemas.microsoft.com/office/word/2018/wordml" xmlns:w16du="http://schemas.microsoft.com/office/word/2023/wordml/word16du" xmlns:w16sdtdh="http://schemas.microsoft.com/office/word/2020/wordml/sdtdatahash" xmlns:w16sdtfl="http://schemas.microsoft.com/office/word/2024/wordml/sdtformatlock" xmlns:w16se="http://schemas.microsoft.com/office/word/2015/wordml/symex" xmlns:wpg="http://schemas.microsoft.com/office/word/2010/wordprocessingGroup" xmlns:wpi="http://schemas.microsoft.com/office/word/2010/wordprocessingInk" xmlns:wne="http://schemas.microsoft.com/office/word/2006/wordml" xmlns:wps="http://schemas.microsoft.com/office/word/2010/wordprocessingShape" mc:Ignorable="w14 w15 w16se w16cid w16 w16cex w16sdtdh w16sdtfl w16du wp14">
+  <w:abstractNum w:abstractNumId="0" w15:restartNumberingAfterBreak="0">
+    <w:nsid w:val="38777876"/>
+    <w:multiLevelType w:val="hybridMultilevel"/>
+    <w:tmpl w:val="9A8C62D2"/>
+    <w:lvl w:ilvl="0" w:tplc="0430129E">
+      <w:numFmt w:val="bullet"/>
+      <w:lvlText w:val="-"/>
+      <w:lvlJc w:val="left"/>
+      <w:pPr>
+        <w:ind w:left="720" w:hanging="360"/>
+      </w:pPr>
+      <w:rPr>
+        <w:rFonts w:ascii="Calibri" w:eastAsiaTheme="minorHAnsi" w:hAnsi="Calibri" w:cs="Calibri" w:hint="default"/>
+      </w:rPr>
+    </w:lvl>
+    <w:lvl w:ilvl="1" w:tplc="10000003" w:tentative="1">
+      <w:start w:val="1"/>
+      <w:numFmt w:val="bullet"/>
+      <w:lvlText w:val="o"/>
+      <w:lvlJc w:val="left"/>
+      <w:pPr>
+        <w:ind w:left="1440" w:hanging="360"/>
+      </w:pPr>
+      <w:rPr>
+        <w:rFonts w:ascii="Courier New" w:hAnsi="Courier New" w:cs="Courier New" w:hint="default"/>
+      </w:rPr>
+    </w:lvl>
+    <w:lvl w:ilvl="2" w:tplc="10000005" w:tentative="1">
+      <w:start w:val="1"/>
+      <w:numFmt w:val="bullet"/>
+      <w:lvlText w:val=""/>
+      <w:lvlJc w:val="left"/>
+      <w:pPr>
+        <w:ind w:left="2160" w:hanging="360"/>
+      </w:pPr>
+      <w:rPr>
+        <w:rFonts w:ascii="Wingdings" w:hAnsi="Wingdings" w:hint="default"/>
+      </w:rPr>
+    </w:lvl>
+    <w:lvl w:ilvl="3" w:tplc="10000001" w:tentative="1">
+      <w:start w:val="1"/>
+      <w:numFmt w:val="bullet"/>
+      <w:lvlText w:val=""/>
+      <w:lvlJc w:val="left"/>
+      <w:pPr>
+        <w:ind w:left="2880" w:hanging="360"/>
+      </w:pPr>
+      <w:rPr>
+        <w:rFonts w:ascii="Symbol" w:hAnsi="Symbol" w:hint="default"/>
+      </w:rPr>
+    </w:lvl>
+    <w:lvl w:ilvl="4" w:tplc="10000003" w:tentative="1">
+      <w:start w:val="1"/>
+      <w:numFmt w:val="bullet"/>
+      <w:lvlText w:val="o"/>
+      <w:lvlJc w:val="left"/>
+      <w:pPr>
+        <w:ind w:left="3600" w:hanging="360"/>
+      </w:pPr>
+      <w:rPr>
+        <w:rFonts w:ascii="Courier New" w:hAnsi="Courier New" w:cs="Courier New" w:hint="default"/>
+      </w:rPr>
+    </w:lvl>
+    <w:lvl w:ilvl="5" w:tplc="10000005" w:tentative="1">
+      <w:start w:val="1"/>
+      <w:numFmt w:val="bullet"/>
+      <w:lvlText w:val=""/>
+      <w:lvlJc w:val="left"/>
+      <w:pPr>
+        <w:ind w:left="4320" w:hanging="360"/>
+      </w:pPr>
+      <w:rPr>
+        <w:rFonts w:ascii="Wingdings" w:hAnsi="Wingdings" w:hint="default"/>
+      </w:rPr>
+    </w:lvl>
+    <w:lvl w:ilvl="6" w:tplc="10000001" w:tentative="1">
+      <w:start w:val="1"/>
+      <w:numFmt w:val="bullet"/>
+      <w:lvlText w:val=""/>
+      <w:lvlJc w:val="left"/>
+      <w:pPr>
+        <w:ind w:left="5040" w:hanging="360"/>
+      </w:pPr>
+      <w:rPr>
+        <w:rFonts w:ascii="Symbol" w:hAnsi="Symbol" w:hint="default"/>
+      </w:rPr>
+    </w:lvl>
+    <w:lvl w:ilvl="7" w:tplc="10000003" w:tentative="1">
+      <w:start w:val="1"/>
+      <w:numFmt w:val="bullet"/>
+      <w:lvlText w:val="o"/>
+      <w:lvlJc w:val="left"/>
+      <w:pPr>
+        <w:ind w:left="5760" w:hanging="360"/>
+      </w:pPr>
+      <w:rPr>
+        <w:rFonts w:ascii="Courier New" w:hAnsi="Courier New" w:cs="Courier New" w:hint="default"/>
+      </w:rPr>
+    </w:lvl>
+    <w:lvl w:ilvl="8" w:tplc="10000005" w:tentative="1">
+      <w:start w:val="1"/>
+      <w:numFmt w:val="bullet"/>
+      <w:lvlText w:val=""/>
+      <w:lvlJc w:val="left"/>
+      <w:pPr>
+        <w:ind w:left="6480" w:hanging="360"/>
+      </w:pPr>
+      <w:rPr>
+        <w:rFonts w:ascii="Wingdings" w:hAnsi="Wingdings" w:hint="default"/>
+      </w:rPr>
+    </w:lvl>
+  </w:abstractNum>
+  <w:num w:numId="1" w16cid:durableId="1436093663">
+    <w:abstractNumId w:val="0"/>
+  </w:num>
+</w:numbering>
 </file>
 
 <file path=word/styles.xml><?xml version="1.0" encoding="utf-8"?>
@@ -1133,6 +1320,29 @@
       <w:spacing w:val="5"/>
     </w:rPr>
   </w:style>
+  <w:style w:type="character" w:styleId="Hyperlink">
+    <w:name w:val="Hyperlink"/>
+    <w:basedOn w:val="DefaultParagraphFont"/>
+    <w:uiPriority w:val="99"/>
+    <w:unhideWhenUsed/>
+    <w:rsid w:val="00CC3D1C"/>
+    <w:rPr>
+      <w:color w:val="0563C1" w:themeColor="hyperlink"/>
+      <w:u w:val="single"/>
+    </w:rPr>
+  </w:style>
+  <w:style w:type="character" w:styleId="UnresolvedMention">
+    <w:name w:val="Unresolved Mention"/>
+    <w:basedOn w:val="DefaultParagraphFont"/>
+    <w:uiPriority w:val="99"/>
+    <w:semiHidden/>
+    <w:unhideWhenUsed/>
+    <w:rsid w:val="00CC3D1C"/>
+    <w:rPr>
+      <w:color w:val="605E5C"/>
+      <w:shd w:val="clear" w:color="auto" w:fill="E1DFDD"/>
+    </w:rPr>
+  </w:style>
 </w:styles>
 </file>
 

</xml_diff>

<commit_message>
change on requirements before merge
</commit_message>
<xml_diff>
--- a/Requirements MVP.docx
+++ b/Requirements MVP.docx
@@ -166,29 +166,96 @@
         <w:pStyle w:val="Heading1"/>
       </w:pPr>
       <w:r>
+        <w:t xml:space="preserve">V 0.2: </w:t>
+      </w:r>
+      <w:r>
+        <w:t>changing the background to fit the image</w:t>
+      </w:r>
+    </w:p>
+    <w:p>
+      <w:r>
+        <w:t xml:space="preserve">Previously the </w:t>
+      </w:r>
+      <w:r>
+        <w:t>part of the background not covered by the image was filled black. We want to fill this space filled with a more appropriate color matching the image. This is typically the most prominent color in the image</w:t>
+      </w:r>
+      <w:r>
+        <w:t>, but taking the border areas with more weight into consideration than the middle of the image typically yields better results.</w:t>
+      </w:r>
+    </w:p>
+    <w:p>
+      <w:pPr>
+        <w:pStyle w:val="Heading1"/>
+      </w:pPr>
+      <w:r>
         <w:t>V 0.</w:t>
       </w:r>
       <w:r>
-        <w:t>2</w:t>
+        <w:t>3</w:t>
       </w:r>
       <w:r>
         <w:t xml:space="preserve">: </w:t>
       </w:r>
       <w:r>
-        <w:t>changing the background to fit the image</w:t>
-      </w:r>
-    </w:p>
-    <w:p>
-      <w:r>
-        <w:t xml:space="preserve">Previously the </w:t>
-      </w:r>
-      <w:r>
-        <w:t>part of the background not covered by the image was filled black. We want to fill this space filled with a more appropriate color matching the image. This is typically the most prominent color in the image</w:t>
-      </w:r>
-      <w:r>
-        <w:t>, but taking the border areas with more weight into consideration than the middle of the image typically yields better results.</w:t>
-      </w:r>
-    </w:p>
+        <w:t>running as a resident program</w:t>
+      </w:r>
+    </w:p>
+    <w:p>
+      <w:r>
+        <w:t>Currently the program changes the wallpapers, and exits. I need it to remain running as a background process, displaying a tray icon. The original process spawns the resident process and exits. The resident process displays the tray icon and keeps running until it gets a command to exit.</w:t>
+      </w:r>
+    </w:p>
+    <w:p>
+      <w:r>
+        <w:t xml:space="preserve">For the tray icon use a down-sized version of </w:t>
+      </w:r>
+      <w:hyperlink r:id="rId5" w:history="1">
+        <w:r>
+          <w:rPr>
+            <w:rStyle w:val="Hyperlink"/>
+          </w:rPr>
+          <w:t>https://t3.ftcdn.net/jpg/01/62/84/92/360_F_162849266_m8X0HwafH2CVtoy7s7Tk1nXh1eQSPIf2.jpg</w:t>
+        </w:r>
+      </w:hyperlink>
+      <w:r>
+        <w:t xml:space="preserve"> . Include this tray icon image with the project files.</w:t>
+      </w:r>
+    </w:p>
+    <w:p>
+      <w:r>
+        <w:t>Hovering over the tray icon displays the name of the program – “Simple Wallpaper Changer”.</w:t>
+      </w:r>
+    </w:p>
+    <w:p>
+      <w:r>
+        <w:t>Right-clicking the tray icon allows the selection of the following operations:</w:t>
+      </w:r>
+    </w:p>
+    <w:p>
+      <w:pPr>
+        <w:pStyle w:val="ListParagraph"/>
+        <w:numPr>
+          <w:ilvl w:val="0"/>
+          <w:numId w:val="1"/>
+        </w:numPr>
+      </w:pPr>
+      <w:r>
+        <w:t>Next: selecting this menu item starts the changing of wallpapers, as per the previous functionality</w:t>
+      </w:r>
+    </w:p>
+    <w:p>
+      <w:pPr>
+        <w:pStyle w:val="ListParagraph"/>
+        <w:numPr>
+          <w:ilvl w:val="0"/>
+          <w:numId w:val="1"/>
+        </w:numPr>
+      </w:pPr>
+      <w:r>
+        <w:t>Exit: ends the resident process, cleaning up all temporary resources like temporary files</w:t>
+      </w:r>
+    </w:p>
+    <w:p/>
     <w:p/>
     <w:sectPr>
       <w:pgSz w:w="11906" w:h="16838"/>
@@ -198,6 +265,126 @@
     </w:sectPr>
   </w:body>
 </w:document>
+</file>
+
+<file path=word/numbering.xml><?xml version="1.0" encoding="utf-8"?>
+<w:numbering xmlns:wpc="http://schemas.microsoft.com/office/word/2010/wordprocessingCanvas" xmlns:cx="http://schemas.microsoft.com/office/drawing/2014/chartex" xmlns:cx1="http://schemas.microsoft.com/office/drawing/2015/9/8/chartex" xmlns:cx2="http://schemas.microsoft.com/office/drawing/2015/10/21/chartex" xmlns:cx3="http://schemas.microsoft.com/office/drawing/2016/5/9/chartex" xmlns:cx4="http://schemas.microsoft.com/office/drawing/2016/5/10/chartex" xmlns:cx5="http://schemas.microsoft.com/office/drawing/2016/5/11/chartex" xmlns:cx6="http://schemas.microsoft.com/office/drawing/2016/5/12/chartex" xmlns:cx7="http://schemas.microsoft.com/office/drawing/2016/5/13/chartex" xmlns:cx8="http://schemas.microsoft.com/office/drawing/2016/5/14/chartex" xmlns:mc="http://schemas.openxmlformats.org/markup-compatibility/2006" xmlns:aink="http://schemas.microsoft.com/office/drawing/2016/ink" xmlns:am3d="http://schemas.microsoft.com/office/drawing/2017/model3d" xmlns:o="urn:schemas-microsoft-com:office:office" xmlns:oel="http://schemas.microsoft.com/office/2019/extlst" xmlns:r="http://schemas.openxmlformats.org/officeDocument/2006/relationships" xmlns:m="http://schemas.openxmlformats.org/officeDocument/2006/math" xmlns:v="urn:schemas-microsoft-com:vml" xmlns:wp14="http://schemas.microsoft.com/office/word/2010/wordprocessingDrawing" xmlns:wp="http://schemas.openxmlformats.org/drawingml/2006/wordprocessingDrawing" xmlns:w10="urn:schemas-microsoft-com:office:word" xmlns:w="http://schemas.openxmlformats.org/wordprocessingml/2006/main" xmlns:w14="http://schemas.microsoft.com/office/word/2010/wordml" xmlns:w15="http://schemas.microsoft.com/office/word/2012/wordml" xmlns:w16cex="http://schemas.microsoft.com/office/word/2018/wordml/cex" xmlns:w16cid="http://schemas.microsoft.com/office/word/2016/wordml/cid" xmlns:w16="http://schemas.microsoft.com/office/word/2018/wordml" xmlns:w16du="http://schemas.microsoft.com/office/word/2023/wordml/word16du" xmlns:w16sdtdh="http://schemas.microsoft.com/office/word/2020/wordml/sdtdatahash" xmlns:w16sdtfl="http://schemas.microsoft.com/office/word/2024/wordml/sdtformatlock" xmlns:w16se="http://schemas.microsoft.com/office/word/2015/wordml/symex" xmlns:wpg="http://schemas.microsoft.com/office/word/2010/wordprocessingGroup" xmlns:wpi="http://schemas.microsoft.com/office/word/2010/wordprocessingInk" xmlns:wne="http://schemas.microsoft.com/office/word/2006/wordml" xmlns:wps="http://schemas.microsoft.com/office/word/2010/wordprocessingShape" mc:Ignorable="w14 w15 w16se w16cid w16 w16cex w16sdtdh w16sdtfl w16du wp14">
+  <w:abstractNum w:abstractNumId="0" w15:restartNumberingAfterBreak="0">
+    <w:nsid w:val="38777876"/>
+    <w:multiLevelType w:val="hybridMultilevel"/>
+    <w:tmpl w:val="9A8C62D2"/>
+    <w:lvl w:ilvl="0" w:tplc="0430129E">
+      <w:numFmt w:val="bullet"/>
+      <w:lvlText w:val="-"/>
+      <w:lvlJc w:val="left"/>
+      <w:pPr>
+        <w:ind w:left="720" w:hanging="360"/>
+      </w:pPr>
+      <w:rPr>
+        <w:rFonts w:ascii="Calibri" w:eastAsiaTheme="minorHAnsi" w:hAnsi="Calibri" w:cs="Calibri" w:hint="default"/>
+      </w:rPr>
+    </w:lvl>
+    <w:lvl w:ilvl="1" w:tplc="10000003" w:tentative="1">
+      <w:start w:val="1"/>
+      <w:numFmt w:val="bullet"/>
+      <w:lvlText w:val="o"/>
+      <w:lvlJc w:val="left"/>
+      <w:pPr>
+        <w:ind w:left="1440" w:hanging="360"/>
+      </w:pPr>
+      <w:rPr>
+        <w:rFonts w:ascii="Courier New" w:hAnsi="Courier New" w:cs="Courier New" w:hint="default"/>
+      </w:rPr>
+    </w:lvl>
+    <w:lvl w:ilvl="2" w:tplc="10000005" w:tentative="1">
+      <w:start w:val="1"/>
+      <w:numFmt w:val="bullet"/>
+      <w:lvlText w:val=""/>
+      <w:lvlJc w:val="left"/>
+      <w:pPr>
+        <w:ind w:left="2160" w:hanging="360"/>
+      </w:pPr>
+      <w:rPr>
+        <w:rFonts w:ascii="Wingdings" w:hAnsi="Wingdings" w:hint="default"/>
+      </w:rPr>
+    </w:lvl>
+    <w:lvl w:ilvl="3" w:tplc="10000001" w:tentative="1">
+      <w:start w:val="1"/>
+      <w:numFmt w:val="bullet"/>
+      <w:lvlText w:val=""/>
+      <w:lvlJc w:val="left"/>
+      <w:pPr>
+        <w:ind w:left="2880" w:hanging="360"/>
+      </w:pPr>
+      <w:rPr>
+        <w:rFonts w:ascii="Symbol" w:hAnsi="Symbol" w:hint="default"/>
+      </w:rPr>
+    </w:lvl>
+    <w:lvl w:ilvl="4" w:tplc="10000003" w:tentative="1">
+      <w:start w:val="1"/>
+      <w:numFmt w:val="bullet"/>
+      <w:lvlText w:val="o"/>
+      <w:lvlJc w:val="left"/>
+      <w:pPr>
+        <w:ind w:left="3600" w:hanging="360"/>
+      </w:pPr>
+      <w:rPr>
+        <w:rFonts w:ascii="Courier New" w:hAnsi="Courier New" w:cs="Courier New" w:hint="default"/>
+      </w:rPr>
+    </w:lvl>
+    <w:lvl w:ilvl="5" w:tplc="10000005" w:tentative="1">
+      <w:start w:val="1"/>
+      <w:numFmt w:val="bullet"/>
+      <w:lvlText w:val=""/>
+      <w:lvlJc w:val="left"/>
+      <w:pPr>
+        <w:ind w:left="4320" w:hanging="360"/>
+      </w:pPr>
+      <w:rPr>
+        <w:rFonts w:ascii="Wingdings" w:hAnsi="Wingdings" w:hint="default"/>
+      </w:rPr>
+    </w:lvl>
+    <w:lvl w:ilvl="6" w:tplc="10000001" w:tentative="1">
+      <w:start w:val="1"/>
+      <w:numFmt w:val="bullet"/>
+      <w:lvlText w:val=""/>
+      <w:lvlJc w:val="left"/>
+      <w:pPr>
+        <w:ind w:left="5040" w:hanging="360"/>
+      </w:pPr>
+      <w:rPr>
+        <w:rFonts w:ascii="Symbol" w:hAnsi="Symbol" w:hint="default"/>
+      </w:rPr>
+    </w:lvl>
+    <w:lvl w:ilvl="7" w:tplc="10000003" w:tentative="1">
+      <w:start w:val="1"/>
+      <w:numFmt w:val="bullet"/>
+      <w:lvlText w:val="o"/>
+      <w:lvlJc w:val="left"/>
+      <w:pPr>
+        <w:ind w:left="5760" w:hanging="360"/>
+      </w:pPr>
+      <w:rPr>
+        <w:rFonts w:ascii="Courier New" w:hAnsi="Courier New" w:cs="Courier New" w:hint="default"/>
+      </w:rPr>
+    </w:lvl>
+    <w:lvl w:ilvl="8" w:tplc="10000005" w:tentative="1">
+      <w:start w:val="1"/>
+      <w:numFmt w:val="bullet"/>
+      <w:lvlText w:val=""/>
+      <w:lvlJc w:val="left"/>
+      <w:pPr>
+        <w:ind w:left="6480" w:hanging="360"/>
+      </w:pPr>
+      <w:rPr>
+        <w:rFonts w:ascii="Wingdings" w:hAnsi="Wingdings" w:hint="default"/>
+      </w:rPr>
+    </w:lvl>
+  </w:abstractNum>
+  <w:num w:numId="1" w16cid:durableId="1436093663">
+    <w:abstractNumId w:val="0"/>
+  </w:num>
+</w:numbering>
 </file>
 
 <file path=word/styles.xml><?xml version="1.0" encoding="utf-8"?>
@@ -1133,6 +1320,29 @@
       <w:spacing w:val="5"/>
     </w:rPr>
   </w:style>
+  <w:style w:type="character" w:styleId="Hyperlink">
+    <w:name w:val="Hyperlink"/>
+    <w:basedOn w:val="DefaultParagraphFont"/>
+    <w:uiPriority w:val="99"/>
+    <w:unhideWhenUsed/>
+    <w:rsid w:val="00CC3D1C"/>
+    <w:rPr>
+      <w:color w:val="0563C1" w:themeColor="hyperlink"/>
+      <w:u w:val="single"/>
+    </w:rPr>
+  </w:style>
+  <w:style w:type="character" w:styleId="UnresolvedMention">
+    <w:name w:val="Unresolved Mention"/>
+    <w:basedOn w:val="DefaultParagraphFont"/>
+    <w:uiPriority w:val="99"/>
+    <w:semiHidden/>
+    <w:unhideWhenUsed/>
+    <w:rsid w:val="00CC3D1C"/>
+    <w:rPr>
+      <w:color w:val="605E5C"/>
+      <w:shd w:val="clear" w:color="auto" w:fill="E1DFDD"/>
+    </w:rPr>
+  </w:style>
 </w:styles>
 </file>
 

</xml_diff>

<commit_message>
AI generated changes for "previous" functionality. Not tested yet.
</commit_message>
<xml_diff>
--- a/Requirements MVP.docx
+++ b/Requirements MVP.docx
@@ -255,7 +255,116 @@
         <w:t>Exit: ends the resident process, cleaning up all temporary resources like temporary files</w:t>
       </w:r>
     </w:p>
-    <w:p/>
+    <w:p>
+      <w:pPr>
+        <w:pStyle w:val="Heading1"/>
+      </w:pPr>
+      <w:r>
+        <w:t>V 0.</w:t>
+      </w:r>
+      <w:r>
+        <w:t>4</w:t>
+      </w:r>
+      <w:r>
+        <w:t xml:space="preserve">: </w:t>
+      </w:r>
+      <w:r>
+        <w:t>“previous” functionality</w:t>
+      </w:r>
+    </w:p>
+    <w:p>
+      <w:r>
+        <w:t>Let’s add a new functionality to the program that allows going backward. Let’s add a “</w:t>
+      </w:r>
+      <w:r>
+        <w:t>P</w:t>
+      </w:r>
+      <w:r>
+        <w:t>revious” operation to the tray icon right click menu</w:t>
+      </w:r>
+      <w:r>
+        <w:t xml:space="preserve"> after “Next”</w:t>
+      </w:r>
+      <w:r>
+        <w:t>.</w:t>
+      </w:r>
+    </w:p>
+    <w:p>
+      <w:r>
+        <w:t>This operation does the opposite as “</w:t>
+      </w:r>
+      <w:r>
+        <w:t>N</w:t>
+      </w:r>
+      <w:r>
+        <w:t xml:space="preserve">ext”. It goes back in the file list enough so there are enough images to be displayed on all displays, and the image on the last display is the previous to the image </w:t>
+      </w:r>
+      <w:r>
+        <w:t xml:space="preserve">to what is </w:t>
+      </w:r>
+      <w:r>
+        <w:t>currently on the first display. So</w:t>
+      </w:r>
+      <w:r>
+        <w:t>,</w:t>
+      </w:r>
+      <w:r>
+        <w:t xml:space="preserve"> if there are 2 displays, then it goes back 1 step from the </w:t>
+      </w:r>
+      <w:r>
+        <w:rPr>
+          <w:lang/>
+        </w:rPr>
+        <w:t>last_image</w:t>
+      </w:r>
+      <w:r>
+        <w:t xml:space="preserve"> (as the </w:t>
+      </w:r>
+      <w:r>
+        <w:rPr>
+          <w:lang/>
+        </w:rPr>
+        <w:t>last_image</w:t>
+      </w:r>
+      <w:r>
+        <w:t xml:space="preserve"> is the image displayed on the 2</w:t>
+      </w:r>
+      <w:r>
+        <w:rPr>
+          <w:vertAlign w:val="superscript"/>
+        </w:rPr>
+        <w:t>nd</w:t>
+      </w:r>
+      <w:r>
+        <w:t xml:space="preserve"> display)</w:t>
+      </w:r>
+      <w:r>
+        <w:t>, then goes back another 2 steps, and displays these on the 1</w:t>
+      </w:r>
+      <w:r>
+        <w:rPr>
+          <w:vertAlign w:val="superscript"/>
+        </w:rPr>
+        <w:t>st</w:t>
+      </w:r>
+      <w:r>
+        <w:t xml:space="preserve"> and 2</w:t>
+      </w:r>
+      <w:r>
+        <w:rPr>
+          <w:vertAlign w:val="superscript"/>
+        </w:rPr>
+        <w:t>nd</w:t>
+      </w:r>
+      <w:r>
+        <w:t xml:space="preserve"> display. This way the 2 operations are the opposite of each other.</w:t>
+      </w:r>
+    </w:p>
+    <w:p>
+      <w:r>
+        <w:t>Keep the same rules for ignoring invalid images and looping, including the looping backwards (before the first image is the last image in the list).</w:t>
+      </w:r>
+    </w:p>
     <w:p/>
     <w:sectPr>
       <w:pgSz w:w="11906" w:h="16838"/>
@@ -993,7 +1102,6 @@
   <w:style w:type="character" w:default="1" w:styleId="DefaultParagraphFont">
     <w:name w:val="Default Paragraph Font"/>
     <w:uiPriority w:val="1"/>
-    <w:semiHidden/>
     <w:unhideWhenUsed/>
   </w:style>
   <w:style w:type="table" w:default="1" w:styleId="TableNormal">

</xml_diff>

<commit_message>
AI made changes, but it is not compiled for some reason
</commit_message>
<xml_diff>
--- a/Requirements MVP.docx
+++ b/Requirements MVP.docx
@@ -312,18 +312,12 @@
         <w:t xml:space="preserve"> if there are 2 displays, then it goes back 1 step from the </w:t>
       </w:r>
       <w:r>
-        <w:rPr>
-          <w:lang/>
-        </w:rPr>
         <w:t>last_image</w:t>
       </w:r>
       <w:r>
         <w:t xml:space="preserve"> (as the </w:t>
       </w:r>
       <w:r>
-        <w:rPr>
-          <w:lang/>
-        </w:rPr>
         <w:t>last_image</w:t>
       </w:r>
       <w:r>
@@ -365,7 +359,61 @@
         <w:t>Keep the same rules for ignoring invalid images and looping, including the looping backwards (before the first image is the last image in the list).</w:t>
       </w:r>
     </w:p>
-    <w:p/>
+    <w:p>
+      <w:pPr>
+        <w:pStyle w:val="Heading1"/>
+      </w:pPr>
+      <w:r>
+        <w:t>V 0.</w:t>
+      </w:r>
+      <w:r>
+        <w:t>5</w:t>
+      </w:r>
+      <w:r>
+        <w:t xml:space="preserve">: </w:t>
+      </w:r>
+      <w:r>
+        <w:t>“Settings” page</w:t>
+      </w:r>
+    </w:p>
+    <w:p>
+      <w:r>
+        <w:t xml:space="preserve">Let’s add a new functionality so our user never has to edit the Settings.ini file manually! Left clicking the system tray icon of our program, or selecting the “Settings…” menu point from the right click menu opens our program window. The window will have several tabs representing different settings, </w:t>
+      </w:r>
+      <w:r>
+        <w:lastRenderedPageBreak/>
+        <w:t>let’s start with the “Startup” and “Sources” tabs. The “Startup” tab contains a single checkbox representing the “</w:t>
+      </w:r>
+      <w:proofErr w:type="spellStart"/>
+      <w:r>
+        <w:t>change_on_start</w:t>
+      </w:r>
+      <w:proofErr w:type="spellEnd"/>
+      <w:r>
+        <w:t>” setting in the .</w:t>
+      </w:r>
+      <w:proofErr w:type="spellStart"/>
+      <w:r>
+        <w:t>ini</w:t>
+      </w:r>
+      <w:proofErr w:type="spellEnd"/>
+      <w:r>
+        <w:t xml:space="preserve"> file. Changing it here changes the .</w:t>
+      </w:r>
+      <w:proofErr w:type="spellStart"/>
+      <w:r>
+        <w:t>ini</w:t>
+      </w:r>
+      <w:proofErr w:type="spellEnd"/>
+      <w:r>
+        <w:t xml:space="preserve"> file setting. The “Sources” tab displays the current source directory, and allows changing it by starting a folder selector so the user can easily select the folder from his folder structure.</w:t>
+      </w:r>
+    </w:p>
+    <w:p>
+      <w:r>
+        <w:t>The window has a “Close” button to close it, or the user can close it with the standard X on the top left. The program saves changes when the changes are done immediately, doesn’t wait for the window to be closed.</w:t>
+      </w:r>
+    </w:p>
     <w:sectPr>
       <w:pgSz w:w="11906" w:h="16838"/>
       <w:pgMar w:top="1440" w:right="1440" w:bottom="1440" w:left="1440" w:header="708" w:footer="708" w:gutter="0"/>
@@ -1102,6 +1150,7 @@
   <w:style w:type="character" w:default="1" w:styleId="DefaultParagraphFont">
     <w:name w:val="Default Paragraph Font"/>
     <w:uiPriority w:val="1"/>
+    <w:semiHidden/>
     <w:unhideWhenUsed/>
   </w:style>
   <w:style w:type="table" w:default="1" w:styleId="TableNormal">

</xml_diff>

<commit_message>
Changes before merging... not sure if we need all these under source control
</commit_message>
<xml_diff>
--- a/Requirements MVP.docx
+++ b/Requirements MVP.docx
@@ -312,18 +312,12 @@
         <w:t xml:space="preserve"> if there are 2 displays, then it goes back 1 step from the </w:t>
       </w:r>
       <w:r>
-        <w:rPr>
-          <w:lang/>
-        </w:rPr>
         <w:t>last_image</w:t>
       </w:r>
       <w:r>
         <w:t xml:space="preserve"> (as the </w:t>
       </w:r>
       <w:r>
-        <w:rPr>
-          <w:lang/>
-        </w:rPr>
         <w:t>last_image</w:t>
       </w:r>
       <w:r>
@@ -365,7 +359,61 @@
         <w:t>Keep the same rules for ignoring invalid images and looping, including the looping backwards (before the first image is the last image in the list).</w:t>
       </w:r>
     </w:p>
-    <w:p/>
+    <w:p>
+      <w:pPr>
+        <w:pStyle w:val="Heading1"/>
+      </w:pPr>
+      <w:r>
+        <w:t>V 0.</w:t>
+      </w:r>
+      <w:r>
+        <w:t>5</w:t>
+      </w:r>
+      <w:r>
+        <w:t xml:space="preserve">: </w:t>
+      </w:r>
+      <w:r>
+        <w:t>“Settings” page</w:t>
+      </w:r>
+    </w:p>
+    <w:p>
+      <w:r>
+        <w:t xml:space="preserve">Let’s add a new functionality so our user never has to edit the Settings.ini file manually! Left clicking the system tray icon of our program, or selecting the “Settings…” menu point from the right click menu opens our program window. The window will have several tabs representing different settings, </w:t>
+      </w:r>
+      <w:r>
+        <w:lastRenderedPageBreak/>
+        <w:t>let’s start with the “Startup” and “Sources” tabs. The “Startup” tab contains a single checkbox representing the “</w:t>
+      </w:r>
+      <w:proofErr w:type="spellStart"/>
+      <w:r>
+        <w:t>change_on_start</w:t>
+      </w:r>
+      <w:proofErr w:type="spellEnd"/>
+      <w:r>
+        <w:t>” setting in the .</w:t>
+      </w:r>
+      <w:proofErr w:type="spellStart"/>
+      <w:r>
+        <w:t>ini</w:t>
+      </w:r>
+      <w:proofErr w:type="spellEnd"/>
+      <w:r>
+        <w:t xml:space="preserve"> file. Changing it here changes the .</w:t>
+      </w:r>
+      <w:proofErr w:type="spellStart"/>
+      <w:r>
+        <w:t>ini</w:t>
+      </w:r>
+      <w:proofErr w:type="spellEnd"/>
+      <w:r>
+        <w:t xml:space="preserve"> file setting. The “Sources” tab displays the current source directory, and allows changing it by starting a folder selector so the user can easily select the folder from his folder structure.</w:t>
+      </w:r>
+    </w:p>
+    <w:p>
+      <w:r>
+        <w:t>The window has a “Close” button to close it, or the user can close it with the standard X on the top left. The program saves changes when the changes are done immediately, doesn’t wait for the window to be closed.</w:t>
+      </w:r>
+    </w:p>
     <w:sectPr>
       <w:pgSz w:w="11906" w:h="16838"/>
       <w:pgMar w:top="1440" w:right="1440" w:bottom="1440" w:left="1440" w:header="708" w:footer="708" w:gutter="0"/>
@@ -1102,6 +1150,7 @@
   <w:style w:type="character" w:default="1" w:styleId="DefaultParagraphFont">
     <w:name w:val="Default Paragraph Font"/>
     <w:uiPriority w:val="1"/>
+    <w:semiHidden/>
     <w:unhideWhenUsed/>
   </w:style>
   <w:style w:type="table" w:default="1" w:styleId="TableNormal">

</xml_diff>

<commit_message>
Playlist display and drag-and-drop to monitor preview done
</commit_message>
<xml_diff>
--- a/Requirements MVP.docx
+++ b/Requirements MVP.docx
@@ -412,6 +412,200 @@
     <w:p>
       <w:r>
         <w:t>The window has a “Close” button to close it, or the user can close it with the standard X on the top left. The program saves changes when the changes are done immediately, doesn’t wait for the window to be closed.</w:t>
+      </w:r>
+    </w:p>
+    <w:p>
+      <w:pPr>
+        <w:pStyle w:val="Heading1"/>
+      </w:pPr>
+      <w:r>
+        <w:t>V 0.</w:t>
+      </w:r>
+      <w:r>
+        <w:t>6</w:t>
+      </w:r>
+      <w:r>
+        <w:t xml:space="preserve">: </w:t>
+      </w:r>
+      <w:r>
+        <w:t>multiple source directory support</w:t>
+      </w:r>
+    </w:p>
+    <w:p>
+      <w:r>
+        <w:t>Let’s expand the features handling the sources. The goal is to allow the user to list several source directories so they’re not limited to one, and they can switch between them easily. This change allows the user:</w:t>
+      </w:r>
+    </w:p>
+    <w:p>
+      <w:pPr>
+        <w:pStyle w:val="ListParagraph"/>
+        <w:numPr>
+          <w:ilvl w:val="0"/>
+          <w:numId w:val="1"/>
+        </w:numPr>
+      </w:pPr>
+      <w:r>
+        <w:t>Add a directory with the folder selector</w:t>
+      </w:r>
+    </w:p>
+    <w:p>
+      <w:pPr>
+        <w:pStyle w:val="ListParagraph"/>
+        <w:numPr>
+          <w:ilvl w:val="0"/>
+          <w:numId w:val="1"/>
+        </w:numPr>
+      </w:pPr>
+      <w:r>
+        <w:t>Add one or more directories with drag-and-drop from the desktop or explorer window</w:t>
+      </w:r>
+    </w:p>
+    <w:p>
+      <w:pPr>
+        <w:pStyle w:val="ListParagraph"/>
+        <w:numPr>
+          <w:ilvl w:val="0"/>
+          <w:numId w:val="1"/>
+        </w:numPr>
+      </w:pPr>
+      <w:r>
+        <w:t>Remove a directory from the list</w:t>
+      </w:r>
+    </w:p>
+    <w:p>
+      <w:pPr>
+        <w:pStyle w:val="ListParagraph"/>
+        <w:numPr>
+          <w:ilvl w:val="0"/>
+          <w:numId w:val="1"/>
+        </w:numPr>
+      </w:pPr>
+      <w:r>
+        <w:t>Re-order the directories with drag-and-drop</w:t>
+      </w:r>
+    </w:p>
+    <w:p>
+      <w:pPr>
+        <w:pStyle w:val="ListParagraph"/>
+        <w:numPr>
+          <w:ilvl w:val="0"/>
+          <w:numId w:val="1"/>
+        </w:numPr>
+      </w:pPr>
+      <w:r>
+        <w:t>Toggle directories in the list on and off</w:t>
+      </w:r>
+    </w:p>
+    <w:p>
+      <w:r>
+        <w:t>This change will also affect how the source directories are written in the .</w:t>
+      </w:r>
+      <w:proofErr w:type="spellStart"/>
+      <w:r>
+        <w:t>ini</w:t>
+      </w:r>
+      <w:proofErr w:type="spellEnd"/>
+      <w:r>
+        <w:t xml:space="preserve"> file – my suggestion would be the same format as the system path is formatted. Toggling could be done with adding a “</w:t>
+      </w:r>
+      <w:proofErr w:type="gramStart"/>
+      <w:r>
+        <w:t>-“</w:t>
+      </w:r>
+      <w:proofErr w:type="gramEnd"/>
+      <w:r>
+        <w:t>-sign</w:t>
+      </w:r>
+      <w:r>
+        <w:t xml:space="preserve"> as the first character for those directories turned off</w:t>
+      </w:r>
+      <w:r>
+        <w:t>, as no path begins with a “</w:t>
+      </w:r>
+      <w:proofErr w:type="gramStart"/>
+      <w:r>
+        <w:t>-“</w:t>
+      </w:r>
+      <w:proofErr w:type="gramEnd"/>
+      <w:r>
+        <w:t>-sign in windows.</w:t>
+      </w:r>
+    </w:p>
+    <w:p>
+      <w:r>
+        <w:t xml:space="preserve">As for how the list of source files is generated, the program should append the list for each directory after one another in the order of the directories. Naturally, switched-off directories are not included. In case no directories are switched on, we default to the same behavior just as the </w:t>
+      </w:r>
+      <w:proofErr w:type="spellStart"/>
+      <w:r>
+        <w:t>source_directory</w:t>
+      </w:r>
+      <w:proofErr w:type="spellEnd"/>
+      <w:r>
+        <w:t xml:space="preserve"> is not given, or empty.</w:t>
+      </w:r>
+    </w:p>
+    <w:p>
+      <w:pPr>
+        <w:pStyle w:val="Heading1"/>
+      </w:pPr>
+      <w:r>
+        <w:t>V 0.</w:t>
+      </w:r>
+      <w:r>
+        <w:t>7</w:t>
+      </w:r>
+      <w:r>
+        <w:t xml:space="preserve">: </w:t>
+      </w:r>
+      <w:r>
+        <w:t>displaying the playlist in settings</w:t>
+      </w:r>
+    </w:p>
+    <w:p>
+      <w:r>
+        <w:t>Let’s add a new tab in Settings called “Playlist”. This tab shows the user the current list of source files the program uses, and allows direct selection of them.</w:t>
+      </w:r>
+    </w:p>
+    <w:p>
+      <w:r>
+        <w:t>First of all, the list of source files is displayed, showing their source directory, name, size, and a thumbnail. If the file is invalid, an icon is displayed in place of the thumbnail indicating that the image can’t be displayed.</w:t>
+      </w:r>
+    </w:p>
+    <w:p>
+      <w:r>
+        <w:t xml:space="preserve">Second, the images currently displayed on all monitors are highlighted. </w:t>
+      </w:r>
+    </w:p>
+    <w:p>
+      <w:r>
+        <w:t>Third</w:t>
+      </w:r>
+      <w:r>
+        <w:t xml:space="preserve">, double clicking on a file sets the </w:t>
+      </w:r>
+      <w:proofErr w:type="spellStart"/>
+      <w:r>
+        <w:t>last_image</w:t>
+      </w:r>
+      <w:proofErr w:type="spellEnd"/>
+      <w:r>
+        <w:t xml:space="preserve"> to the selected file, and starts the changing process, changing the background(s).</w:t>
+      </w:r>
+      <w:r>
+        <w:t xml:space="preserve"> The same rules apply for skipping and looping as normal.</w:t>
+      </w:r>
+    </w:p>
+    <w:p>
+      <w:r>
+        <w:t>Fourth, on right click on a file displays a popup-menu that includes an operation for each connected display – “Set as background on &lt;display name&gt;”. This operation sets the “</w:t>
+      </w:r>
+      <w:proofErr w:type="spellStart"/>
+      <w:r>
+        <w:t>last_image</w:t>
+      </w:r>
+      <w:proofErr w:type="spellEnd"/>
+      <w:r>
+        <w:t>” setting based on existing rules, and sets the background on the given display to the selected image, but doesn’t touch the rest of the displays.</w:t>
       </w:r>
     </w:p>
     <w:sectPr>

</xml_diff>